<commit_message>
Sua loi code trong cv10-11 va bao cao
</commit_message>
<xml_diff>
--- a/Feature_Engineering/Viec12/Bao_Cao_Feature_Engineering.docx
+++ b/Feature_Engineering/Viec12/Bao_Cao_Feature_Engineering.docx
@@ -6,12 +6,14 @@
       <w:pPr>
         <w:jc w:val="both"/>
         <w:rPr>
+          <w:rFonts w:cs="Times New Roman"/>
           <w:sz w:val="30"/>
           <w:szCs w:val="30"/>
         </w:rPr>
       </w:pPr>
       <w:r>
         <w:rPr>
+          <w:rFonts w:cs="Times New Roman"/>
           <w:sz w:val="30"/>
           <w:szCs w:val="30"/>
         </w:rPr>
@@ -92,6 +94,36 @@
         </w:rPr>
         <w:t>Cơ sở: Trong y khoa, tỷ lệ giữa lượng đường huyết và insulin thường được sử dụng để đánh giá tình trạng kháng insulin (Insulin Resistance) – một trong những nguyên nhân chính gây ra bệnh tiểu đường type 2. Tỷ lệ này biến động sẽ phản ánh khả năng chuyển hóa đường của cơ thể tốt hơn là nhìn vào từng chỉ số độc lập.</w:t>
       </w:r>
+      <w:r>
+        <w:rPr>
+          <w:sz w:val="28"/>
+          <w:szCs w:val="28"/>
+        </w:rPr>
+        <w:t xml:space="preserve"> </w:t>
+      </w:r>
+      <w:r>
+        <w:rPr>
+          <w:sz w:val="28"/>
+          <w:szCs w:val="28"/>
+        </w:rPr>
+        <w:t xml:space="preserve">Về mặt kỹ thuật, để đảm bảo an toàn tính toán và tránh lỗi chia cho 0 trong quá trình dự đoán (inference), cột Insulin đã được ràng buộc giới hạn dưới tại mức </w:t>
+      </w:r>
+      <w:r>
+        <w:rPr>
+          <w:rStyle w:val="HTMLCode"/>
+          <w:rFonts w:ascii="Times New Roman" w:hAnsi="Times New Roman" w:cs="Times New Roman"/>
+          <w:sz w:val="24"/>
+          <w:szCs w:val="24"/>
+        </w:rPr>
+        <w:t>1e-6</w:t>
+      </w:r>
+      <w:r>
+        <w:rPr>
+          <w:sz w:val="28"/>
+          <w:szCs w:val="28"/>
+        </w:rPr>
+        <w:t xml:space="preserve"> trước khi thực hiện phép chia.</w:t>
+      </w:r>
     </w:p>
     <w:p>
       <w:pPr>
@@ -236,11 +268,19 @@
           <w:sz w:val="28"/>
           <w:szCs w:val="28"/>
         </w:rPr>
-        <w:t xml:space="preserve"> Thay vì dùng </w:t>
+        <w:t xml:space="preserve"> </w:t>
+      </w:r>
+      <w:r>
+        <w:rPr>
+          <w:sz w:val="28"/>
+          <w:szCs w:val="28"/>
+        </w:rPr>
+        <w:t xml:space="preserve">Thay vì dùng </w:t>
       </w:r>
       <w:r>
         <w:rPr>
           <w:rStyle w:val="HTMLCode"/>
+          <w:rFonts w:ascii="Times New Roman" w:hAnsi="Times New Roman" w:cs="Times New Roman"/>
           <w:sz w:val="24"/>
           <w:szCs w:val="24"/>
         </w:rPr>
@@ -251,20 +291,12 @@
           <w:sz w:val="28"/>
           <w:szCs w:val="28"/>
         </w:rPr>
-        <w:t xml:space="preserve"> (không hỗ trợ dữ liệu âm sau khi dùng StandardScaler), nhóm đã thử nghiệm bằng </w:t>
-      </w:r>
-      <w:r>
-        <w:rPr>
-          <w:b/>
-          <w:bCs/>
-          <w:sz w:val="28"/>
-          <w:szCs w:val="28"/>
-        </w:rPr>
-        <w:t>ANOVA F-value (</w:t>
+        <w:t>, nhóm thử nghiệm bằng ANOVA F-value (</w:t>
       </w:r>
       <w:r>
         <w:rPr>
           <w:rStyle w:val="HTMLCode"/>
+          <w:rFonts w:ascii="Times New Roman" w:hAnsi="Times New Roman" w:cs="Times New Roman"/>
           <w:b/>
           <w:bCs/>
           <w:sz w:val="24"/>
@@ -274,35 +306,26 @@
       </w:r>
       <w:r>
         <w:rPr>
+          <w:sz w:val="28"/>
+          <w:szCs w:val="28"/>
+        </w:rPr>
+        <w:t xml:space="preserve">) và Mutual Information. Để đảm bảo không có rò rỉ dữ liệu, kết quả được đánh giá bằng </w:t>
+      </w:r>
+      <w:r>
+        <w:rPr>
           <w:b/>
           <w:bCs/>
           <w:sz w:val="28"/>
           <w:szCs w:val="28"/>
         </w:rPr>
-        <w:t>)</w:t>
-      </w:r>
-      <w:r>
-        <w:rPr>
-          <w:sz w:val="28"/>
-          <w:szCs w:val="28"/>
-        </w:rPr>
-        <w:t xml:space="preserve"> và </w:t>
-      </w:r>
-      <w:r>
-        <w:rPr>
-          <w:b/>
-          <w:bCs/>
-          <w:sz w:val="28"/>
-          <w:szCs w:val="28"/>
-        </w:rPr>
-        <w:t>Mutual Information</w:t>
-      </w:r>
-      <w:r>
-        <w:rPr>
-          <w:sz w:val="28"/>
-          <w:szCs w:val="28"/>
-        </w:rPr>
-        <w:t>.</w:t>
+        <w:t>kỹ thuật Stratified 5-Fold Cross-Validation</w:t>
+      </w:r>
+      <w:r>
+        <w:rPr>
+          <w:sz w:val="28"/>
+          <w:szCs w:val="28"/>
+        </w:rPr>
+        <w:t xml:space="preserve"> ngay trên tập huấn luyện (Train set), tập Test được giữ kín tuyệt đối cho đến vòng thẩm định cuối cùng của Model Lead.</w:t>
       </w:r>
     </w:p>
     <w:p>
@@ -325,6 +348,7 @@
           <w:sz w:val="28"/>
           <w:szCs w:val="28"/>
         </w:rPr>
+        <w:lastRenderedPageBreak/>
         <w:t>Kết quả:</w:t>
       </w:r>
       <w:r>
@@ -332,30 +356,46 @@
           <w:sz w:val="28"/>
           <w:szCs w:val="28"/>
         </w:rPr>
-        <w:t xml:space="preserve"> Dựa trên thử nghiệm đánh giá độ chính xác (Accuracy), phương pháp </w:t>
+        <w:t xml:space="preserve"> </w:t>
+      </w:r>
+      <w:r>
+        <w:rPr>
+          <w:sz w:val="28"/>
+          <w:szCs w:val="28"/>
+        </w:rPr>
+        <w:t>Dựa trên điểm trung bình Accuracy của Cross-Validation (CV_Accuracy_Train), phương pháp</w:t>
+      </w:r>
+      <w:r>
+        <w:rPr>
+          <w:sz w:val="28"/>
+          <w:szCs w:val="28"/>
+        </w:rPr>
+        <w:t xml:space="preserve"> </w:t>
       </w:r>
       <w:r>
         <w:rPr>
           <w:b/>
           <w:bCs/>
-          <w:sz w:val="28"/>
-          <w:szCs w:val="28"/>
-        </w:rPr>
-        <w:t>f_classif (Chọn top 8)</w:t>
-      </w:r>
-      <w:r>
-        <w:rPr>
-          <w:sz w:val="28"/>
-          <w:szCs w:val="28"/>
-        </w:rPr>
-        <w:t xml:space="preserve"> </w:t>
-      </w:r>
-      <w:r>
-        <w:rPr>
-          <w:sz w:val="28"/>
-          <w:szCs w:val="28"/>
-        </w:rPr>
-        <w:t>cho kết quả tối ưu nhất trên tập Validation.</w:t>
+          <w:sz w:val="32"/>
+          <w:szCs w:val="32"/>
+        </w:rPr>
+        <w:t>f</w:t>
+      </w:r>
+      <w:r>
+        <w:rPr>
+          <w:b/>
+          <w:bCs/>
+          <w:sz w:val="28"/>
+          <w:szCs w:val="28"/>
+        </w:rPr>
+        <w:t>_classif (Chọn top 8)</w:t>
+      </w:r>
+      <w:r>
+        <w:rPr>
+          <w:sz w:val="28"/>
+          <w:szCs w:val="28"/>
+        </w:rPr>
+        <w:t xml:space="preserve"> cho kết quả tối ưu nhất trên tập Validation.</w:t>
       </w:r>
     </w:p>
     <w:p>
@@ -411,7 +451,6 @@
           <w:sz w:val="31"/>
           <w:szCs w:val="31"/>
         </w:rPr>
-        <w:lastRenderedPageBreak/>
         <w:t>3. Giới hạn diễn giải (Limitation of Interpretation)</w:t>
       </w:r>
     </w:p>
@@ -464,6 +503,9 @@
       <w:r>
         <w:rPr>
           <w:rStyle w:val="HTMLCode"/>
+          <w:rFonts w:ascii="Times New Roman" w:hAnsi="Times New Roman" w:cs="Times New Roman"/>
+          <w:b/>
+          <w:bCs/>
           <w:sz w:val="24"/>
           <w:szCs w:val="24"/>
         </w:rPr>
@@ -479,6 +521,9 @@
       <w:r>
         <w:rPr>
           <w:rStyle w:val="HTMLCode"/>
+          <w:rFonts w:ascii="Times New Roman" w:hAnsi="Times New Roman" w:cs="Times New Roman"/>
+          <w:b/>
+          <w:bCs/>
           <w:sz w:val="24"/>
           <w:szCs w:val="24"/>
         </w:rPr>
@@ -494,6 +539,7 @@
       <w:r>
         <w:rPr>
           <w:rStyle w:val="HTMLCode"/>
+          <w:rFonts w:ascii="Times New Roman" w:hAnsi="Times New Roman" w:cs="Times New Roman"/>
           <w:sz w:val="24"/>
           <w:szCs w:val="24"/>
         </w:rPr>
@@ -539,6 +585,9 @@
       <w:r>
         <w:rPr>
           <w:rStyle w:val="HTMLCode"/>
+          <w:rFonts w:ascii="Times New Roman" w:hAnsi="Times New Roman" w:cs="Times New Roman"/>
+          <w:b/>
+          <w:bCs/>
           <w:sz w:val="24"/>
           <w:szCs w:val="24"/>
         </w:rPr>
@@ -550,6 +599,36 @@
           <w:szCs w:val="28"/>
         </w:rPr>
         <w:t xml:space="preserve"> được tính toán sau khi cột Insulin đã được điền các giá trị rỗng (NaN) bằng giá trị trung vị (Median). Do số lượng missing value ở cột Insulin gốc khá lớn, các tỷ lệ này ở một số bệnh nhân là dữ liệu ước tính, có thể không phản ánh chính xác 100% tình trạng lâm sàng thực tế của họ.</w:t>
+      </w:r>
+      <w:r>
+        <w:rPr>
+          <w:sz w:val="28"/>
+          <w:szCs w:val="28"/>
+        </w:rPr>
+        <w:t xml:space="preserve"> </w:t>
+      </w:r>
+      <w:r>
+        <w:rPr>
+          <w:sz w:val="28"/>
+          <w:szCs w:val="28"/>
+        </w:rPr>
+        <w:t>Ngoài ra, việc ép giới hạn toán học cực tiểu (</w:t>
+      </w:r>
+      <w:r>
+        <w:rPr>
+          <w:rStyle w:val="HTMLCode"/>
+          <w:rFonts w:ascii="Times New Roman" w:hAnsi="Times New Roman" w:cs="Times New Roman"/>
+          <w:sz w:val="24"/>
+          <w:szCs w:val="24"/>
+        </w:rPr>
+        <w:t>clip lower=1e-6</w:t>
+      </w:r>
+      <w:r>
+        <w:rPr>
+          <w:sz w:val="28"/>
+          <w:szCs w:val="28"/>
+        </w:rPr>
+        <w:t>) ở mẫu số tuy giải quyết được lỗi phần mềm nhưng có thể đẩy tỷ lệ Ratio lên rất cao ở một vài ca bệnh, gây ra các nhiễu ngoại lai nhỏ.</w:t>
       </w:r>
     </w:p>
     <w:p>
@@ -584,6 +663,7 @@
       <w:r>
         <w:rPr>
           <w:rStyle w:val="HTMLCode"/>
+          <w:rFonts w:ascii="Times New Roman" w:hAnsi="Times New Roman" w:cs="Times New Roman"/>
           <w:sz w:val="24"/>
           <w:szCs w:val="24"/>
         </w:rPr>
@@ -601,6 +681,7 @@
       <w:pPr>
         <w:jc w:val="both"/>
         <w:rPr>
+          <w:rFonts w:cs="Times New Roman"/>
           <w:sz w:val="28"/>
           <w:szCs w:val="26"/>
         </w:rPr>

</xml_diff>